<commit_message>
sync: 2026-05-22 15:13:34 from Cowork
</commit_message>
<xml_diff>
--- a/outputs/Ledger_Rollup_Strategic_Memo.docx
+++ b/outputs/Ledger_Rollup_Strategic_Memo.docx
@@ -264,6 +264,21 @@
         <w:rPr>
           <w:rFonts w:ascii="Calibri" w:hAnsi="Calibri"/>
           <w:b w:val="0"/>
+          <w:i/>
+          <w:color w:val="101010"/>
+          <w:sz w:val="21"/>
+        </w:rPr>
+        <w:t>There are two direct precedents and both have already won: Sumer Group (UK, founded 2022, Penta Capital-backed, £100M revenue in 12 months across 34 acquisitions, now in £700M–£1bn strategic review) is the M&amp;A roll-up playbook; Visma (Norway, Hg/KKR-backed, €2.5B+ revenue, 300+ acquisitions) is the AI-platform playbook. Our edge is doing both simultaneously, one geography down, before either reaches PL/IT/CY at scale.</w:t>
+      </w:r>
+    </w:p>
+    <w:p>
+      <w:pPr>
+        <w:spacing w:after="80" w:line="300" w:lineRule="auto"/>
+      </w:pPr>
+      <w:r>
+        <w:rPr>
+          <w:rFonts w:ascii="Calibri" w:hAnsi="Calibri"/>
+          <w:b w:val="0"/>
           <w:i w:val="0"/>
           <w:color w:val="101010"/>
           <w:sz w:val="22"/>
@@ -529,7 +544,7 @@
           <w:color w:val="1F3A5F"/>
           <w:sz w:val="28"/>
         </w:rPr>
-        <w:t>2.1  Sumer.io — the AI-accounting product wedge</w:t>
+        <w:t>2.1  Sumer Group (UK) — the buy-and-build precedent</w:t>
       </w:r>
     </w:p>
     <w:p>
@@ -544,7 +559,203 @@
           <w:color w:val="101010"/>
           <w:sz w:val="21"/>
         </w:rPr>
-        <w:t>Sumer.io operates in the Spanish AI-accounting category for self-employed (autónomos) and micro-SMB. The category is well-documented through peer companies (Holded, Anfix, Quipu, Declarando, Taxdown, Tax Down, Billin), all of which target the same buyer with an AI-augmented bookkeeping product and a recurring subscription model.</w:t>
+        <w:t>Sumer Group (sumer.co.uk) is the closest direct precedent for Project Ledger. Founded 2022 by Warren Mead (ex-COO KPMG UK) and two former KPMG colleagues, backed by Penta Capital, Sumer is a PE-backed M&amp;A consolidator of UK regional SME accountancy practices. In ~36 months it has gone from zero to one of the fastest-scaling accountancy platforms in the UK and is now (Sept 2025) in a strategic review with Continuum targeting a £700M–£1bn exit.</w:t>
+      </w:r>
+    </w:p>
+    <w:p>
+      <w:pPr>
+        <w:spacing w:before="200" w:after="40"/>
+      </w:pPr>
+      <w:r>
+        <w:rPr>
+          <w:rFonts w:ascii="Calibri" w:hAnsi="Calibri"/>
+          <w:b/>
+          <w:color w:val="FF6B35"/>
+          <w:sz w:val="23"/>
+        </w:rPr>
+        <w:t>Sumer at a glance (verified facts)</w:t>
+      </w:r>
+    </w:p>
+    <w:p>
+      <w:pPr>
+        <w:pStyle w:val="ListBullet"/>
+        <w:spacing w:after="40" w:line="288" w:lineRule="auto"/>
+      </w:pPr>
+      <w:r>
+        <w:rPr>
+          <w:rFonts w:ascii="Calibri" w:hAnsi="Calibri"/>
+          <w:b/>
+          <w:sz w:val="21"/>
+        </w:rPr>
+        <w:t>Founding:</w:t>
+      </w:r>
+      <w:r>
+        <w:rPr>
+          <w:rFonts w:ascii="Calibri" w:hAnsi="Calibri"/>
+          <w:sz w:val="21"/>
+        </w:rPr>
+        <w:t xml:space="preserve"> Founded 2022 by Warren Mead (ex-KPMG UK COO) and two KPMG co-founders.</w:t>
+      </w:r>
+    </w:p>
+    <w:p>
+      <w:pPr>
+        <w:pStyle w:val="ListBullet"/>
+        <w:spacing w:after="40" w:line="288" w:lineRule="auto"/>
+      </w:pPr>
+      <w:r>
+        <w:rPr>
+          <w:rFonts w:ascii="Calibri" w:hAnsi="Calibri"/>
+          <w:b/>
+          <w:sz w:val="21"/>
+        </w:rPr>
+        <w:t>PE backer:</w:t>
+      </w:r>
+      <w:r>
+        <w:rPr>
+          <w:rFonts w:ascii="Calibri" w:hAnsi="Calibri"/>
+          <w:sz w:val="21"/>
+        </w:rPr>
+        <w:t xml:space="preserve"> Penta Capital (UK lower-mid-market PE).</w:t>
+      </w:r>
+    </w:p>
+    <w:p>
+      <w:pPr>
+        <w:pStyle w:val="ListBullet"/>
+        <w:spacing w:after="40" w:line="288" w:lineRule="auto"/>
+      </w:pPr>
+      <w:r>
+        <w:rPr>
+          <w:rFonts w:ascii="Calibri" w:hAnsi="Calibri"/>
+          <w:b/>
+          <w:sz w:val="21"/>
+        </w:rPr>
+        <w:t>Deal count:</w:t>
+      </w:r>
+      <w:r>
+        <w:rPr>
+          <w:rFonts w:ascii="Calibri" w:hAnsi="Calibri"/>
+          <w:sz w:val="21"/>
+        </w:rPr>
+        <w:t xml:space="preserve"> 34 acquisitions closed since 2023.</w:t>
+      </w:r>
+    </w:p>
+    <w:p>
+      <w:pPr>
+        <w:pStyle w:val="ListBullet"/>
+        <w:spacing w:after="40" w:line="288" w:lineRule="auto"/>
+      </w:pPr>
+      <w:r>
+        <w:rPr>
+          <w:rFonts w:ascii="Calibri" w:hAnsi="Calibri"/>
+          <w:b/>
+          <w:sz w:val="21"/>
+        </w:rPr>
+        <w:t>Revenue:</w:t>
+      </w:r>
+      <w:r>
+        <w:rPr>
+          <w:rFonts w:ascii="Calibri" w:hAnsi="Calibri"/>
+          <w:sz w:val="21"/>
+        </w:rPr>
+        <w:t xml:space="preserve"> £100M+ revenue achieved 12 months after first close (Feb 2024).</w:t>
+      </w:r>
+    </w:p>
+    <w:p>
+      <w:pPr>
+        <w:pStyle w:val="ListBullet"/>
+        <w:spacing w:after="40" w:line="288" w:lineRule="auto"/>
+      </w:pPr>
+      <w:r>
+        <w:rPr>
+          <w:rFonts w:ascii="Calibri" w:hAnsi="Calibri"/>
+          <w:b/>
+          <w:sz w:val="21"/>
+        </w:rPr>
+        <w:t>Scale:</w:t>
+      </w:r>
+      <w:r>
+        <w:rPr>
+          <w:rFonts w:ascii="Calibri" w:hAnsi="Calibri"/>
+          <w:sz w:val="21"/>
+        </w:rPr>
+        <w:t xml:space="preserve"> 2,400 colleagues, 65 offices, 55,000+ SME clients (Sept 2025); now 3,000+ colleagues and 80+ offices per latest website.</w:t>
+      </w:r>
+    </w:p>
+    <w:p>
+      <w:pPr>
+        <w:pStyle w:val="ListBullet"/>
+        <w:spacing w:after="40" w:line="288" w:lineRule="auto"/>
+      </w:pPr>
+      <w:r>
+        <w:rPr>
+          <w:rFonts w:ascii="Calibri" w:hAnsi="Calibri"/>
+          <w:b/>
+          <w:sz w:val="21"/>
+        </w:rPr>
+        <w:t>Ranking:</w:t>
+      </w:r>
+      <w:r>
+        <w:rPr>
+          <w:rFonts w:ascii="Calibri" w:hAnsi="Calibri"/>
+          <w:sz w:val="21"/>
+        </w:rPr>
+        <w:t xml:space="preserve"> 13th largest accounting network in the UK.</w:t>
+      </w:r>
+    </w:p>
+    <w:p>
+      <w:pPr>
+        <w:pStyle w:val="ListBullet"/>
+        <w:spacing w:after="40" w:line="288" w:lineRule="auto"/>
+      </w:pPr>
+      <w:r>
+        <w:rPr>
+          <w:rFonts w:ascii="Calibri" w:hAnsi="Calibri"/>
+          <w:b/>
+          <w:sz w:val="21"/>
+        </w:rPr>
+        <w:t>Exit path:</w:t>
+      </w:r>
+      <w:r>
+        <w:rPr>
+          <w:rFonts w:ascii="Calibri" w:hAnsi="Calibri"/>
+          <w:sz w:val="21"/>
+        </w:rPr>
+        <w:t xml:space="preserve"> Strategic review with boutique advisor Continuum targeting £1bn valuation; industry consensus £700M (FT sources).</w:t>
+      </w:r>
+    </w:p>
+    <w:p>
+      <w:pPr>
+        <w:pStyle w:val="ListBullet"/>
+        <w:spacing w:after="40" w:line="288" w:lineRule="auto"/>
+      </w:pPr>
+      <w:r>
+        <w:rPr>
+          <w:rFonts w:ascii="Calibri" w:hAnsi="Calibri"/>
+          <w:b/>
+          <w:sz w:val="21"/>
+        </w:rPr>
+        <w:t>Strategy:</w:t>
+      </w:r>
+      <w:r>
+        <w:rPr>
+          <w:rFonts w:ascii="Calibri" w:hAnsi="Calibri"/>
+          <w:sz w:val="21"/>
+        </w:rPr>
+        <w:t xml:space="preserve"> "Regional Champions" model — buys majority stakes in mid-sized accounting firms, lets them retain brand and local identity, centralizes back-office (HR, finance, compliance, tech, payroll).</w:t>
+      </w:r>
+    </w:p>
+    <w:p>
+      <w:pPr>
+        <w:spacing w:before="200" w:after="40"/>
+      </w:pPr>
+      <w:r>
+        <w:rPr>
+          <w:rFonts w:ascii="Calibri" w:hAnsi="Calibri"/>
+          <w:b/>
+          <w:color w:val="FF6B35"/>
+          <w:sz w:val="23"/>
+        </w:rPr>
+        <w:t>UK competitive landscape — proof the category works</w:t>
       </w:r>
     </w:p>
     <w:p>
@@ -559,107 +770,397 @@
           <w:color w:val="101010"/>
           <w:sz w:val="21"/>
         </w:rPr>
-        <w:t>Sumer.io itself is a smaller, more recent entrant and is not publicly indexable at memo-grade detail. We therefore treat it as the category reference, not a fact-checked company profile, and use Holded (acquired by Visma 2021) as the proxy data point. The wedge mechanics are identical:</w:t>
+        <w:t>Sumer is not alone — the UK has produced six PE-backed accountancy consolidators in the past 5 years, all profitable at scale:</w:t>
       </w:r>
     </w:p>
-    <w:p>
-      <w:pPr>
-        <w:spacing w:before="200" w:after="40"/>
-      </w:pPr>
-      <w:r>
-        <w:rPr>
-          <w:rFonts w:ascii="Calibri" w:hAnsi="Calibri"/>
-          <w:b/>
-          <w:color w:val="FF6B35"/>
-          <w:sz w:val="23"/>
-        </w:rPr>
-        <w:t>Category USP (Unique Selling Proposition)</w:t>
-      </w:r>
-    </w:p>
-    <w:p>
-      <w:pPr>
-        <w:pStyle w:val="ListBullet"/>
-        <w:spacing w:after="40" w:line="288" w:lineRule="auto"/>
-      </w:pPr>
-      <w:r>
-        <w:rPr>
-          <w:rFonts w:ascii="Calibri" w:hAnsi="Calibri"/>
-          <w:b/>
-          <w:sz w:val="21"/>
-        </w:rPr>
-        <w:t>What it sells:</w:t>
-      </w:r>
-      <w:r>
-        <w:rPr>
-          <w:rFonts w:ascii="Calibri" w:hAnsi="Calibri"/>
-          <w:sz w:val="21"/>
-        </w:rPr>
-        <w:t xml:space="preserve"> Replace a part-time gestor / bookkeeper with a SaaS that ingests invoices via OCR, auto-categorizes, prepares VAT/IRPF returns, and ships them to the tax authority.</w:t>
-      </w:r>
-    </w:p>
-    <w:p>
-      <w:pPr>
-        <w:pStyle w:val="ListBullet"/>
-        <w:spacing w:after="40" w:line="288" w:lineRule="auto"/>
-      </w:pPr>
-      <w:r>
-        <w:rPr>
-          <w:rFonts w:ascii="Calibri" w:hAnsi="Calibri"/>
-          <w:b/>
-          <w:sz w:val="21"/>
-        </w:rPr>
-        <w:t>Price point:</w:t>
-      </w:r>
-      <w:r>
-        <w:rPr>
-          <w:rFonts w:ascii="Calibri" w:hAnsi="Calibri"/>
-          <w:sz w:val="21"/>
-        </w:rPr>
-        <w:t xml:space="preserve"> €20–80 / month per seat (depending on tier), all-in price replacing €60–200 / month of part-time human bookkeeping.</w:t>
-      </w:r>
-    </w:p>
-    <w:p>
-      <w:pPr>
-        <w:pStyle w:val="ListBullet"/>
-        <w:spacing w:after="40" w:line="288" w:lineRule="auto"/>
-      </w:pPr>
-      <w:r>
-        <w:rPr>
-          <w:rFonts w:ascii="Calibri" w:hAnsi="Calibri"/>
-          <w:b/>
-          <w:sz w:val="21"/>
-        </w:rPr>
-        <w:t>Onboarding:</w:t>
-      </w:r>
-      <w:r>
-        <w:rPr>
-          <w:rFonts w:ascii="Calibri" w:hAnsi="Calibri"/>
-          <w:sz w:val="21"/>
-        </w:rPr>
-        <w:t xml:space="preserve"> Time-to-onboard 15 minutes via bank-feed + email-forwarding for invoices.</w:t>
-      </w:r>
-    </w:p>
-    <w:p>
-      <w:pPr>
-        <w:pStyle w:val="ListBullet"/>
-        <w:spacing w:after="40" w:line="288" w:lineRule="auto"/>
-      </w:pPr>
-      <w:r>
-        <w:rPr>
-          <w:rFonts w:ascii="Calibri" w:hAnsi="Calibri"/>
-          <w:b/>
-          <w:sz w:val="21"/>
-        </w:rPr>
-        <w:t>Automation:</w:t>
-      </w:r>
-      <w:r>
-        <w:rPr>
-          <w:rFonts w:ascii="Calibri" w:hAnsi="Calibri"/>
-          <w:sz w:val="21"/>
-        </w:rPr>
-        <w:t xml:space="preserve"> 70–85% claimed automation rate on routine entries, with a human accountant-of-record signing off the return.</w:t>
-      </w:r>
-    </w:p>
+    <w:tbl>
+      <w:tblPr>
+        <w:tblW w:type="auto" w:w="0"/>
+        <w:jc w:val="center"/>
+        <w:tblLook w:firstColumn="1" w:firstRow="1" w:lastColumn="0" w:lastRow="0" w:noHBand="0" w:noVBand="1" w:val="04A0"/>
+        <w:tblBorders>
+          <w:top w:val="single" w:sz="4" w:color="BFBFBF"/>
+          <w:left w:val="single" w:sz="4" w:color="BFBFBF"/>
+          <w:bottom w:val="single" w:sz="4" w:color="BFBFBF"/>
+          <w:right w:val="single" w:sz="4" w:color="BFBFBF"/>
+          <w:insideH w:val="single" w:sz="4" w:color="BFBFBF"/>
+          <w:insideV w:val="single" w:sz="4" w:color="BFBFBF"/>
+        </w:tblBorders>
+      </w:tblPr>
+      <w:tblGrid>
+        <w:gridCol w:w="3249"/>
+        <w:gridCol w:w="3249"/>
+        <w:gridCol w:w="3249"/>
+      </w:tblGrid>
+      <w:tr>
+        <w:tc>
+          <w:tcPr>
+            <w:tcW w:type="dxa" w:w="2551"/>
+            <w:shd w:val="clear" w:color="auto" w:fill="1F3A5F"/>
+            <w:vAlign w:val="center"/>
+          </w:tcPr>
+          <w:p>
+            <w:r/>
+            <w:r>
+              <w:rPr>
+                <w:rFonts w:ascii="Calibri" w:hAnsi="Calibri"/>
+                <w:b/>
+                <w:color w:val="FFFFFF"/>
+                <w:sz w:val="20"/>
+              </w:rPr>
+              <w:t>Consolidator</w:t>
+            </w:r>
+          </w:p>
+        </w:tc>
+        <w:tc>
+          <w:tcPr>
+            <w:tcW w:type="dxa" w:w="2835"/>
+            <w:shd w:val="clear" w:color="auto" w:fill="1F3A5F"/>
+            <w:vAlign w:val="center"/>
+          </w:tcPr>
+          <w:p>
+            <w:r/>
+            <w:r>
+              <w:rPr>
+                <w:rFonts w:ascii="Calibri" w:hAnsi="Calibri"/>
+                <w:b/>
+                <w:color w:val="FFFFFF"/>
+                <w:sz w:val="20"/>
+              </w:rPr>
+              <w:t>PE backer</w:t>
+            </w:r>
+          </w:p>
+        </w:tc>
+        <w:tc>
+          <w:tcPr>
+            <w:tcW w:type="dxa" w:w="3402"/>
+            <w:shd w:val="clear" w:color="auto" w:fill="1F3A5F"/>
+            <w:vAlign w:val="center"/>
+          </w:tcPr>
+          <w:p>
+            <w:r/>
+            <w:r>
+              <w:rPr>
+                <w:rFonts w:ascii="Calibri" w:hAnsi="Calibri"/>
+                <w:b/>
+                <w:color w:val="FFFFFF"/>
+                <w:sz w:val="20"/>
+              </w:rPr>
+              <w:t>Scale (latest)</w:t>
+            </w:r>
+          </w:p>
+        </w:tc>
+      </w:tr>
+      <w:tr>
+        <w:tc>
+          <w:tcPr>
+            <w:tcW w:type="dxa" w:w="2551"/>
+            <w:vAlign w:val="center"/>
+          </w:tcPr>
+          <w:p>
+            <w:r/>
+            <w:r>
+              <w:rPr>
+                <w:rFonts w:ascii="Calibri" w:hAnsi="Calibri"/>
+                <w:sz w:val="19"/>
+              </w:rPr>
+              <w:t>Azets</w:t>
+            </w:r>
+          </w:p>
+        </w:tc>
+        <w:tc>
+          <w:tcPr>
+            <w:tcW w:type="dxa" w:w="2835"/>
+            <w:vAlign w:val="center"/>
+          </w:tcPr>
+          <w:p>
+            <w:r/>
+            <w:r>
+              <w:rPr>
+                <w:rFonts w:ascii="Calibri" w:hAnsi="Calibri"/>
+                <w:sz w:val="19"/>
+              </w:rPr>
+              <w:t>PAI Partners (acq. from HgCapital)</w:t>
+            </w:r>
+          </w:p>
+        </w:tc>
+        <w:tc>
+          <w:tcPr>
+            <w:tcW w:type="dxa" w:w="3402"/>
+            <w:vAlign w:val="center"/>
+          </w:tcPr>
+          <w:p>
+            <w:r/>
+            <w:r>
+              <w:rPr>
+                <w:rFonts w:ascii="Calibri" w:hAnsi="Calibri"/>
+                <w:sz w:val="19"/>
+              </w:rPr>
+              <w:t>8,000+ staff, £800M+ revenue</w:t>
+            </w:r>
+          </w:p>
+        </w:tc>
+      </w:tr>
+      <w:tr>
+        <w:tc>
+          <w:tcPr>
+            <w:tcW w:type="dxa" w:w="2551"/>
+            <w:shd w:val="clear" w:color="auto" w:fill="F4F6F9"/>
+            <w:vAlign w:val="center"/>
+          </w:tcPr>
+          <w:p>
+            <w:r/>
+            <w:r>
+              <w:rPr>
+                <w:rFonts w:ascii="Calibri" w:hAnsi="Calibri"/>
+                <w:sz w:val="19"/>
+              </w:rPr>
+              <w:t>Sumer</w:t>
+            </w:r>
+          </w:p>
+        </w:tc>
+        <w:tc>
+          <w:tcPr>
+            <w:tcW w:type="dxa" w:w="2835"/>
+            <w:shd w:val="clear" w:color="auto" w:fill="F4F6F9"/>
+            <w:vAlign w:val="center"/>
+          </w:tcPr>
+          <w:p>
+            <w:r/>
+            <w:r>
+              <w:rPr>
+                <w:rFonts w:ascii="Calibri" w:hAnsi="Calibri"/>
+                <w:sz w:val="19"/>
+              </w:rPr>
+              <w:t>Penta Capital</w:t>
+            </w:r>
+          </w:p>
+        </w:tc>
+        <w:tc>
+          <w:tcPr>
+            <w:tcW w:type="dxa" w:w="3402"/>
+            <w:shd w:val="clear" w:color="auto" w:fill="F4F6F9"/>
+            <w:vAlign w:val="center"/>
+          </w:tcPr>
+          <w:p>
+            <w:r/>
+            <w:r>
+              <w:rPr>
+                <w:rFonts w:ascii="Calibri" w:hAnsi="Calibri"/>
+                <w:sz w:val="19"/>
+              </w:rPr>
+              <w:t>~2,400 staff, £100M+ revenue, ~36 months</w:t>
+            </w:r>
+          </w:p>
+        </w:tc>
+      </w:tr>
+      <w:tr>
+        <w:tc>
+          <w:tcPr>
+            <w:tcW w:type="dxa" w:w="2551"/>
+            <w:vAlign w:val="center"/>
+          </w:tcPr>
+          <w:p>
+            <w:r/>
+            <w:r>
+              <w:rPr>
+                <w:rFonts w:ascii="Calibri" w:hAnsi="Calibri"/>
+                <w:sz w:val="19"/>
+              </w:rPr>
+              <w:t>Xeinadin</w:t>
+            </w:r>
+          </w:p>
+        </w:tc>
+        <w:tc>
+          <w:tcPr>
+            <w:tcW w:type="dxa" w:w="2835"/>
+            <w:vAlign w:val="center"/>
+          </w:tcPr>
+          <w:p>
+            <w:r/>
+            <w:r>
+              <w:rPr>
+                <w:rFonts w:ascii="Calibri" w:hAnsi="Calibri"/>
+                <w:sz w:val="19"/>
+              </w:rPr>
+              <w:t>Exponent Private Equity</w:t>
+            </w:r>
+          </w:p>
+        </w:tc>
+        <w:tc>
+          <w:tcPr>
+            <w:tcW w:type="dxa" w:w="3402"/>
+            <w:vAlign w:val="center"/>
+          </w:tcPr>
+          <w:p>
+            <w:r/>
+            <w:r>
+              <w:rPr>
+                <w:rFonts w:ascii="Calibri" w:hAnsi="Calibri"/>
+                <w:sz w:val="19"/>
+              </w:rPr>
+              <w:t>~2,500 staff, ~€250M revenue</w:t>
+            </w:r>
+          </w:p>
+        </w:tc>
+      </w:tr>
+      <w:tr>
+        <w:tc>
+          <w:tcPr>
+            <w:tcW w:type="dxa" w:w="2551"/>
+            <w:shd w:val="clear" w:color="auto" w:fill="F4F6F9"/>
+            <w:vAlign w:val="center"/>
+          </w:tcPr>
+          <w:p>
+            <w:r/>
+            <w:r>
+              <w:rPr>
+                <w:rFonts w:ascii="Calibri" w:hAnsi="Calibri"/>
+                <w:sz w:val="19"/>
+              </w:rPr>
+              <w:t>Gravita</w:t>
+            </w:r>
+          </w:p>
+        </w:tc>
+        <w:tc>
+          <w:tcPr>
+            <w:tcW w:type="dxa" w:w="2835"/>
+            <w:shd w:val="clear" w:color="auto" w:fill="F4F6F9"/>
+            <w:vAlign w:val="center"/>
+          </w:tcPr>
+          <w:p>
+            <w:r/>
+            <w:r>
+              <w:rPr>
+                <w:rFonts w:ascii="Calibri" w:hAnsi="Calibri"/>
+                <w:sz w:val="19"/>
+              </w:rPr>
+              <w:t>Sovereign Capital</w:t>
+            </w:r>
+          </w:p>
+        </w:tc>
+        <w:tc>
+          <w:tcPr>
+            <w:tcW w:type="dxa" w:w="3402"/>
+            <w:shd w:val="clear" w:color="auto" w:fill="F4F6F9"/>
+            <w:vAlign w:val="center"/>
+          </w:tcPr>
+          <w:p>
+            <w:r/>
+            <w:r>
+              <w:rPr>
+                <w:rFonts w:ascii="Calibri" w:hAnsi="Calibri"/>
+                <w:sz w:val="19"/>
+              </w:rPr>
+              <w:t>~700 staff</w:t>
+            </w:r>
+          </w:p>
+        </w:tc>
+      </w:tr>
+      <w:tr>
+        <w:tc>
+          <w:tcPr>
+            <w:tcW w:type="dxa" w:w="2551"/>
+            <w:vAlign w:val="center"/>
+          </w:tcPr>
+          <w:p>
+            <w:r/>
+            <w:r>
+              <w:rPr>
+                <w:rFonts w:ascii="Calibri" w:hAnsi="Calibri"/>
+                <w:sz w:val="19"/>
+              </w:rPr>
+              <w:t>Cooper Parry</w:t>
+            </w:r>
+          </w:p>
+        </w:tc>
+        <w:tc>
+          <w:tcPr>
+            <w:tcW w:type="dxa" w:w="2835"/>
+            <w:vAlign w:val="center"/>
+          </w:tcPr>
+          <w:p>
+            <w:r/>
+            <w:r>
+              <w:rPr>
+                <w:rFonts w:ascii="Calibri" w:hAnsi="Calibri"/>
+                <w:sz w:val="19"/>
+              </w:rPr>
+              <w:t>Waterland</w:t>
+            </w:r>
+          </w:p>
+        </w:tc>
+        <w:tc>
+          <w:tcPr>
+            <w:tcW w:type="dxa" w:w="3402"/>
+            <w:vAlign w:val="center"/>
+          </w:tcPr>
+          <w:p>
+            <w:r/>
+            <w:r>
+              <w:rPr>
+                <w:rFonts w:ascii="Calibri" w:hAnsi="Calibri"/>
+                <w:sz w:val="19"/>
+              </w:rPr>
+              <w:t>~1,000 staff</w:t>
+            </w:r>
+          </w:p>
+        </w:tc>
+      </w:tr>
+      <w:tr>
+        <w:tc>
+          <w:tcPr>
+            <w:tcW w:type="dxa" w:w="2551"/>
+            <w:shd w:val="clear" w:color="auto" w:fill="F4F6F9"/>
+            <w:vAlign w:val="center"/>
+          </w:tcPr>
+          <w:p>
+            <w:r/>
+            <w:r>
+              <w:rPr>
+                <w:rFonts w:ascii="Calibri" w:hAnsi="Calibri"/>
+                <w:sz w:val="19"/>
+              </w:rPr>
+              <w:t>AAB Group</w:t>
+            </w:r>
+          </w:p>
+        </w:tc>
+        <w:tc>
+          <w:tcPr>
+            <w:tcW w:type="dxa" w:w="2835"/>
+            <w:shd w:val="clear" w:color="auto" w:fill="F4F6F9"/>
+            <w:vAlign w:val="center"/>
+          </w:tcPr>
+          <w:p>
+            <w:r/>
+            <w:r>
+              <w:rPr>
+                <w:rFonts w:ascii="Calibri" w:hAnsi="Calibri"/>
+                <w:sz w:val="19"/>
+              </w:rPr>
+              <w:t>August Equity</w:t>
+            </w:r>
+          </w:p>
+        </w:tc>
+        <w:tc>
+          <w:tcPr>
+            <w:tcW w:type="dxa" w:w="3402"/>
+            <w:shd w:val="clear" w:color="auto" w:fill="F4F6F9"/>
+            <w:vAlign w:val="center"/>
+          </w:tcPr>
+          <w:p>
+            <w:r/>
+            <w:r>
+              <w:rPr>
+                <w:rFonts w:ascii="Calibri" w:hAnsi="Calibri"/>
+                <w:sz w:val="19"/>
+              </w:rPr>
+              <w:t>~700 staff</w:t>
+            </w:r>
+          </w:p>
+        </w:tc>
+      </w:tr>
+    </w:tbl>
     <w:p>
       <w:pPr>
         <w:spacing w:before="200" w:after="40"/>
@@ -686,7 +1187,85 @@
           <w:color w:val="101010"/>
           <w:sz w:val="21"/>
         </w:rPr>
-        <w:t>We do not need to invent or buy Sumer.io — its category is the playbook for our AI overlay. We acquire the labor base (accounting practices), then deploy a Holded/Sumer-equivalent layer on top. The combined entity captures the recurring SaaS economics AND the existing trusted-advisor relationship that pure SaaS players spend years building. The valuation math: an acquired practice at 4× EBITDA, software-overlaid in 12 months, re-rates to 8–10× EBITDA at exit — a 2.0–2.5× multiple expansion on margin-expanded EBITDA. That is the entire arbitrage.</w:t>
+        <w:t>Sumer is the proof-of-concept for our entire thesis. They started with zero, raised PE in 2022, and built a £100M-revenue platform in 12 months across 34 acquisitions — and are now in conversation about a £700M–£1bn exit at 36 months. That is the exact trajectory we want, with three deliberate differences:</w:t>
+      </w:r>
+    </w:p>
+    <w:p>
+      <w:pPr>
+        <w:pStyle w:val="ListBullet"/>
+        <w:spacing w:after="40" w:line="288" w:lineRule="auto"/>
+      </w:pPr>
+      <w:r>
+        <w:rPr>
+          <w:rFonts w:ascii="Calibri" w:hAnsi="Calibri"/>
+          <w:b/>
+          <w:sz w:val="21"/>
+        </w:rPr>
+        <w:t>Geography:</w:t>
+      </w:r>
+      <w:r>
+        <w:rPr>
+          <w:rFonts w:ascii="Calibri" w:hAnsi="Calibri"/>
+          <w:sz w:val="21"/>
+        </w:rPr>
+        <w:t xml:space="preserve"> UK is fully picked over (6 PE-backed consolidators competing for the same long tail, pushing entry multiples from 4× to 6–7× EBITDA). PL/IT/CY are 24–36 months behind the UK on consolidator penetration.</w:t>
+      </w:r>
+    </w:p>
+    <w:p>
+      <w:pPr>
+        <w:pStyle w:val="ListBullet"/>
+        <w:spacing w:after="40" w:line="288" w:lineRule="auto"/>
+      </w:pPr>
+      <w:r>
+        <w:rPr>
+          <w:rFonts w:ascii="Calibri" w:hAnsi="Calibri"/>
+          <w:b/>
+          <w:sz w:val="21"/>
+        </w:rPr>
+        <w:t>AI overlay:</w:t>
+      </w:r>
+      <w:r>
+        <w:rPr>
+          <w:rFonts w:ascii="Calibri" w:hAnsi="Calibri"/>
+          <w:sz w:val="21"/>
+        </w:rPr>
+        <w:t xml:space="preserve"> Sumer is centralization + scale, not AI-led. Our AI overlay is the additional margin lever Sumer has not yet pulled — a defendable differentiator AND an exit valuation kicker.</w:t>
+      </w:r>
+    </w:p>
+    <w:p>
+      <w:pPr>
+        <w:pStyle w:val="ListBullet"/>
+        <w:spacing w:after="40" w:line="288" w:lineRule="auto"/>
+      </w:pPr>
+      <w:r>
+        <w:rPr>
+          <w:rFonts w:ascii="Calibri" w:hAnsi="Calibri"/>
+          <w:b/>
+          <w:sz w:val="21"/>
+        </w:rPr>
+        <w:t>Capital scale:</w:t>
+      </w:r>
+      <w:r>
+        <w:rPr>
+          <w:rFonts w:ascii="Calibri" w:hAnsi="Calibri"/>
+          <w:sz w:val="21"/>
+        </w:rPr>
+        <w:t xml:space="preserve"> Sumer raises in £40M+ chunks via mid-market PE. We are starting one tier smaller — angels + €6M Series A — to get to Sumer's 12-month £100M-revenue point with €25–35M revenue over 4–5 years. Same playbook, ~30% the scale.</w:t>
+      </w:r>
+    </w:p>
+    <w:p>
+      <w:pPr>
+        <w:spacing w:after="80" w:line="300" w:lineRule="auto"/>
+      </w:pPr>
+      <w:r>
+        <w:rPr>
+          <w:rFonts w:ascii="Calibri" w:hAnsi="Calibri"/>
+          <w:b w:val="0"/>
+          <w:i/>
+          <w:color w:val="101010"/>
+          <w:sz w:val="21"/>
+        </w:rPr>
+        <w:t>Sumer is also a credible exit alternative to Visma. A continental EU consolidator at €30M revenue across 14 practices is exactly the bolt-on asset Sumer (or any UK consolidator) would want for European expansion at FY30.</w:t>
       </w:r>
     </w:p>
     <w:p>
@@ -10225,7 +10804,7 @@
           <w:rFonts w:ascii="Calibri" w:hAnsi="Calibri"/>
           <w:sz w:val="21"/>
         </w:rPr>
-        <w:t>Sumer.io treated as category reference (Spanish AI-accounting wedge); not all data points individually fact-checked against Sumer specifically — Holded (Visma-owned since 2021) used as proxy where needed.</w:t>
+        <w:t>Sumer Group (sumer.co.uk) data points sourced from: sumer.co.uk official site, The Finance Story (Sept 2025), Accountancy Daily, Accountancy Age, Insider Media, Rainmakers (TheBusinessDesk). Cross-referenced with Penta Capital portfolio page.</w:t>
       </w:r>
     </w:p>
     <w:p>
@@ -10307,6 +10886,71 @@
           <w:sz w:val="21"/>
         </w:rPr>
         <w:t>Primary public sources:</w:t>
+      </w:r>
+    </w:p>
+    <w:p>
+      <w:pPr>
+        <w:pStyle w:val="ListBullet"/>
+        <w:spacing w:after="40" w:line="288" w:lineRule="auto"/>
+      </w:pPr>
+      <w:r>
+        <w:rPr>
+          <w:rFonts w:ascii="Calibri" w:hAnsi="Calibri"/>
+          <w:sz w:val="21"/>
+        </w:rPr>
+        <w:t>Sumer Group — sumer.co.uk (corporate site, About, Press releases including "Sumer Hits £100m Revenue, Just 12 Months After Launch" Feb 2024)</w:t>
+      </w:r>
+    </w:p>
+    <w:p>
+      <w:pPr>
+        <w:pStyle w:val="ListBullet"/>
+        <w:spacing w:after="40" w:line="288" w:lineRule="auto"/>
+      </w:pPr>
+      <w:r>
+        <w:rPr>
+          <w:rFonts w:ascii="Calibri" w:hAnsi="Calibri"/>
+          <w:sz w:val="21"/>
+        </w:rPr>
+        <w:t>Accountancy Age — "Ex-KPMG COO eyes £1bn valuation for his own accountancy firm" (2 Sept 2025)</w:t>
+      </w:r>
+    </w:p>
+    <w:p>
+      <w:pPr>
+        <w:pStyle w:val="ListBullet"/>
+        <w:spacing w:after="40" w:line="288" w:lineRule="auto"/>
+      </w:pPr>
+      <w:r>
+        <w:rPr>
+          <w:rFonts w:ascii="Calibri" w:hAnsi="Calibri"/>
+          <w:sz w:val="21"/>
+        </w:rPr>
+        <w:t>The Finance Story — Warren Mead profile (Sept 2025)</w:t>
+      </w:r>
+    </w:p>
+    <w:p>
+      <w:pPr>
+        <w:pStyle w:val="ListBullet"/>
+        <w:spacing w:after="40" w:line="288" w:lineRule="auto"/>
+      </w:pPr>
+      <w:r>
+        <w:rPr>
+          <w:rFonts w:ascii="Calibri" w:hAnsi="Calibri"/>
+          <w:sz w:val="21"/>
+        </w:rPr>
+        <w:t>Accountancy Daily — "Sumer plans more acquisitions for £100m accounting group"</w:t>
+      </w:r>
+    </w:p>
+    <w:p>
+      <w:pPr>
+        <w:pStyle w:val="ListBullet"/>
+        <w:spacing w:after="40" w:line="288" w:lineRule="auto"/>
+      </w:pPr>
+      <w:r>
+        <w:rPr>
+          <w:rFonts w:ascii="Calibri" w:hAnsi="Calibri"/>
+          <w:sz w:val="21"/>
+        </w:rPr>
+        <w:t>Penta Capital — portfolio page</w:t>
       </w:r>
     </w:p>
     <w:p>

</xml_diff>